<commit_message>
Matrice de preuves : 16 indicateurs de la grille, chacun rattache a sa preuve localisable + denominateurs de concentration explicites
</commit_message>
<xml_diff>
--- a/docs/Cahier_des_charges_BottleNeck_v2.docx
+++ b/docs/Cahier_des_charges_BottleNeck_v2.docx
@@ -16085,7 +16085,7 @@
           <w:sz w:val="21"/>
           <w:szCs w:val="21"/>
         </w:rPr>
-        <w:t xml:space="preserve">Pourquoi 53 % des références pour 80 % du chiffre d'affaires signifie une dispersion et non une concentration — et ce que cela change pour la stratégie de gamme.</w:t>
+        <w:t xml:space="preserve">Pourquoi 435 références sur 689 pour 80 % du chiffre d'affaires signifie une dispersion et non une concentration — et ce que cela change pour la stratégie de gamme.</w:t>
       </w:r>
     </w:p>
     <w:p>
@@ -18649,7 +18649,7 @@
                 <w:sz w:val="19"/>
                 <w:szCs w:val="19"/>
               </w:rPr>
-              <w:t xml:space="preserve">Ici, 53 % des références font 80 % du chiffre d'affaires.</w:t>
+              <w:t xml:space="preserve">Ici, 435 références sur 689 vendues font 80 % du chiffre d'affaires.</w:t>
             </w:r>
           </w:p>
         </w:tc>

</xml_diff>